<commit_message>
[compile] pandoc-based docx build: figures in-text, abstract single-page, title/abstract/body page breaks
</commit_message>
<xml_diff>
--- a/output/manuscript.docx
+++ b/output/manuscript.docx
@@ -156,16 +156,22 @@
     </w:p>
     <w:bookmarkStart w:id="9" w:name="abstract"/>
     <w:p>
-      <w:pPr>
-        <w:pStyle w:val="Heading2"/>
-      </w:pPr>
-      <w:r>
-        <w:t xml:space="preserve">Abstract</w:t>
+      <w:r>
+        <w:br w:type="page"/>
       </w:r>
     </w:p>
     <w:p>
       <w:pPr>
+        <w:pStyle w:val="Heading2"/>
+      </w:pPr>
+      <w:r>
+        <w:t xml:space="preserve">Abstract</w:t>
+      </w:r>
+    </w:p>
+    <w:p>
+      <w:pPr>
         <w:pStyle w:val="FirstParagraph"/>
+        <w:spacing w:line="240" w:lineRule="auto" w:after="0" w:before="0"/>
       </w:pPr>
       <w:r>
         <w:rPr>
@@ -184,6 +190,7 @@
     <w:p>
       <w:pPr>
         <w:pStyle w:val="BodyText"/>
+        <w:spacing w:line="240" w:lineRule="auto" w:after="0" w:before="0"/>
       </w:pPr>
       <w:r>
         <w:rPr>
@@ -202,6 +209,7 @@
     <w:p>
       <w:pPr>
         <w:pStyle w:val="BodyText"/>
+        <w:spacing w:line="240" w:lineRule="auto" w:after="0" w:before="0"/>
       </w:pPr>
       <w:r>
         <w:rPr>
@@ -220,6 +228,7 @@
     <w:p>
       <w:pPr>
         <w:pStyle w:val="BodyText"/>
+        <w:spacing w:line="240" w:lineRule="auto" w:after="0" w:before="0"/>
       </w:pPr>
       <w:r>
         <w:rPr>
@@ -238,6 +247,7 @@
     <w:p>
       <w:pPr>
         <w:pStyle w:val="BodyText"/>
+        <w:spacing w:line="240" w:lineRule="auto" w:after="0" w:before="0"/>
       </w:pPr>
       <w:r>
         <w:rPr>
@@ -256,6 +266,7 @@
     <w:p>
       <w:pPr>
         <w:pStyle w:val="BodyText"/>
+        <w:spacing w:line="240" w:lineRule="auto" w:after="0" w:before="0"/>
       </w:pPr>
       <w:r>
         <w:rPr>
@@ -274,6 +285,11 @@
     <w:bookmarkEnd w:id="9"/>
     <w:bookmarkStart w:id="14" w:name="introduction"/>
     <w:p>
+      <w:r>
+        <w:br w:type="page"/>
+      </w:r>
+    </w:p>
+    <w:p>
       <w:pPr>
         <w:pStyle w:val="Heading2"/>
       </w:pPr>
@@ -508,6 +524,64 @@
       </w:pPr>
       <w:r>
         <w:t xml:space="preserve">Survival probabilities at 18, 24, 36, 48, and 60 months were extracted from the published Kaplan-Meier curves (Figure 1, Khattak et al. 2026). For each arm, log-normal distribution parameters were calibrated to the observed survival probabilities via nonlinear least squares — separately for OS and for the conditional ratios r_DM(t) = DMFS(t)/OS(t) and r_LR(t) = RFS(t)/DMFS(t). This ratio-constrained approach guarantees that the three survival curves are structurally consistent over the entire time horizon [11,13]. All fitted values are reported in Table S2 (Supplementary Materials).</w:t>
+      </w:r>
+    </w:p>
+    <w:p>
+      <w:pPr>
+        <w:pStyle w:val="BodyText"/>
+      </w:pPr>
+      <w:r>
+        <w:rPr>
+          <w:b/>
+          <w:bCs/>
+        </w:rPr>
+        <w:t xml:space="preserve">Figure 1:</w:t>
+      </w:r>
+      <w:r>
+        <w:t xml:space="preserve"> </w:t>
+      </w:r>
+      <w:r>
+        <w:t xml:space="preserve">** Log-normal model RFS and OS curves, with 5-year data points from KEYNOTE-942</w:t>
+      </w:r>
+    </w:p>
+    <w:p>
+      <w:pPr>
+        <w:pStyle w:val="BodyText"/>
+      </w:pPr>
+      <w:r/>
+      <w:r>
+        <w:drawing>
+          <wp:inline>
+            <wp:extent cx="5029200" cy="2225009"/>
+            <wp:docPr id="1" name="Picture 1"/>
+            <wp:cNvGraphicFramePr>
+              <a:graphicFrameLocks noChangeAspect="1"/>
+            </wp:cNvGraphicFramePr>
+            <a:graphic>
+              <a:graphicData uri="http://schemas.openxmlformats.org/drawingml/2006/picture">
+                <pic:pic>
+                  <pic:nvPicPr>
+                    <pic:cNvPr id="0" name="fig1_survival.png"/>
+                    <pic:cNvPicPr/>
+                  </pic:nvPicPr>
+                  <pic:blipFill>
+                    <a:blip r:embed="rId9"/>
+                    <a:stretch>
+                      <a:fillRect/>
+                    </a:stretch>
+                  </pic:blipFill>
+                  <pic:spPr>
+                    <a:xfrm>
+                      <a:off x="0" y="0"/>
+                      <a:ext cx="5029200" cy="2225009"/>
+                    </a:xfrm>
+                    <a:prstGeom prst="rect"/>
+                  </pic:spPr>
+                </pic:pic>
+              </a:graphicData>
+            </a:graphic>
+          </wp:inline>
+        </w:drawing>
       </w:r>
     </w:p>
     <w:bookmarkEnd w:id="16"/>
@@ -1620,6 +1694,122 @@
           <w:b/>
           <w:bCs/>
         </w:rPr>
+        <w:t xml:space="preserve">Figure 2:</w:t>
+      </w:r>
+      <w:r>
+        <w:t xml:space="preserve"> </w:t>
+      </w:r>
+      <w:r>
+        <w:t xml:space="preserve">** Cost-effectiveness acceptability curve</w:t>
+      </w:r>
+    </w:p>
+    <w:p>
+      <w:pPr>
+        <w:pStyle w:val="BodyText"/>
+      </w:pPr>
+      <w:r/>
+      <w:r>
+        <w:drawing>
+          <wp:inline>
+            <wp:extent cx="5029200" cy="3112097"/>
+            <wp:docPr id="2" name="Picture 2"/>
+            <wp:cNvGraphicFramePr>
+              <a:graphicFrameLocks noChangeAspect="1"/>
+            </wp:cNvGraphicFramePr>
+            <a:graphic>
+              <a:graphicData uri="http://schemas.openxmlformats.org/drawingml/2006/picture">
+                <pic:pic>
+                  <pic:nvPicPr>
+                    <pic:cNvPr id="0" name="fig2_ceac.png"/>
+                    <pic:cNvPicPr/>
+                  </pic:nvPicPr>
+                  <pic:blipFill>
+                    <a:blip r:embed="rId10"/>
+                    <a:stretch>
+                      <a:fillRect/>
+                    </a:stretch>
+                  </pic:blipFill>
+                  <pic:spPr>
+                    <a:xfrm>
+                      <a:off x="0" y="0"/>
+                      <a:ext cx="5029200" cy="3112097"/>
+                    </a:xfrm>
+                    <a:prstGeom prst="rect"/>
+                  </pic:spPr>
+                </pic:pic>
+              </a:graphicData>
+            </a:graphic>
+          </wp:inline>
+        </w:drawing>
+      </w:r>
+    </w:p>
+    <w:p>
+      <w:pPr>
+        <w:pStyle w:val="BodyText"/>
+      </w:pPr>
+      <w:r>
+        <w:rPr>
+          <w:b/>
+          <w:bCs/>
+        </w:rPr>
+        <w:t xml:space="preserve">Figure 4:</w:t>
+      </w:r>
+      <w:r>
+        <w:t xml:space="preserve"> </w:t>
+      </w:r>
+      <w:r>
+        <w:t xml:space="preserve">** Cost-effectiveness plane (1,000 PSA iterations)</w:t>
+      </w:r>
+    </w:p>
+    <w:p>
+      <w:pPr>
+        <w:pStyle w:val="BodyText"/>
+      </w:pPr>
+      <w:r/>
+      <w:r>
+        <w:drawing>
+          <wp:inline>
+            <wp:extent cx="5029200" cy="3112097"/>
+            <wp:docPr id="4" name="Picture 4"/>
+            <wp:cNvGraphicFramePr>
+              <a:graphicFrameLocks noChangeAspect="1"/>
+            </wp:cNvGraphicFramePr>
+            <a:graphic>
+              <a:graphicData uri="http://schemas.openxmlformats.org/drawingml/2006/picture">
+                <pic:pic>
+                  <pic:nvPicPr>
+                    <pic:cNvPr id="0" name="fig4_ce_plane.png"/>
+                    <pic:cNvPicPr/>
+                  </pic:nvPicPr>
+                  <pic:blipFill>
+                    <a:blip r:embed="rId12"/>
+                    <a:stretch>
+                      <a:fillRect/>
+                    </a:stretch>
+                  </pic:blipFill>
+                  <pic:spPr>
+                    <a:xfrm>
+                      <a:off x="0" y="0"/>
+                      <a:ext cx="5029200" cy="3112097"/>
+                    </a:xfrm>
+                    <a:prstGeom prst="rect"/>
+                  </pic:spPr>
+                </pic:pic>
+              </a:graphicData>
+            </a:graphic>
+          </wp:inline>
+        </w:drawing>
+      </w:r>
+    </w:p>
+    <w:p>
+      <w:pPr>
+        <w:pStyle w:val="BodyText"/>
+      </w:pPr>
+      <w:r>
+        <w:rPr>
+          <w:b/>
+          <w:bCs/>
+        </w:rPr>
         <w:t xml:space="preserve">Table 3. Probabilistic Sensitivity Analysis</w:t>
       </w:r>
     </w:p>
@@ -1797,6 +1987,64 @@
       </w:pPr>
       <w:r>
         <w:t xml:space="preserve">One-way sensitivity analysis (Figure 3) identified the 5-year RFS rate for the combination arm as the most influential parameter, followed by the DM monthly cost and the intismeran price. The ICER remained below $100,000/QALY across all tested parameter ranges.</w:t>
+      </w:r>
+    </w:p>
+    <w:p>
+      <w:pPr>
+        <w:pStyle w:val="BodyText"/>
+      </w:pPr>
+      <w:r>
+        <w:rPr>
+          <w:b/>
+          <w:bCs/>
+        </w:rPr>
+        <w:t xml:space="preserve">Figure 3:</w:t>
+      </w:r>
+      <w:r>
+        <w:t xml:space="preserve"> </w:t>
+      </w:r>
+      <w:r>
+        <w:t xml:space="preserve">** Tornado diagram, one-way sensitivity analysis</w:t>
+      </w:r>
+    </w:p>
+    <w:p>
+      <w:pPr>
+        <w:pStyle w:val="BodyText"/>
+      </w:pPr>
+      <w:r/>
+      <w:r>
+        <w:drawing>
+          <wp:inline>
+            <wp:extent cx="5029200" cy="3110780"/>
+            <wp:docPr id="3" name="Picture 3"/>
+            <wp:cNvGraphicFramePr>
+              <a:graphicFrameLocks noChangeAspect="1"/>
+            </wp:cNvGraphicFramePr>
+            <a:graphic>
+              <a:graphicData uri="http://schemas.openxmlformats.org/drawingml/2006/picture">
+                <pic:pic>
+                  <pic:nvPicPr>
+                    <pic:cNvPr id="0" name="fig3_tornado.png"/>
+                    <pic:cNvPicPr/>
+                  </pic:nvPicPr>
+                  <pic:blipFill>
+                    <a:blip r:embed="rId11"/>
+                    <a:stretch>
+                      <a:fillRect/>
+                    </a:stretch>
+                  </pic:blipFill>
+                  <pic:spPr>
+                    <a:xfrm>
+                      <a:off x="0" y="0"/>
+                      <a:ext cx="5029200" cy="3110780"/>
+                    </a:xfrm>
+                    <a:prstGeom prst="rect"/>
+                  </pic:spPr>
+                </pic:pic>
+              </a:graphicData>
+            </a:graphic>
+          </wp:inline>
+        </w:drawing>
       </w:r>
     </w:p>
     <w:bookmarkEnd w:id="25"/>
@@ -2459,7 +2707,7 @@
       </w:r>
     </w:p>
     <w:bookmarkEnd w:id="33"/>
-    <w:bookmarkStart w:id="50" w:name="references"/>
+    <w:bookmarkStart w:id="34" w:name="references"/>
     <w:p>
       <w:pPr>
         <w:pStyle w:val="Heading2"/>
@@ -2554,197 +2802,7 @@
         <w:t xml:space="preserve">[14] Mclean A, van Hest N. An exploratory cost-effectiveness analysis of cancer vaccines in combination with current immune checkpoint inhibitors vs immune checkpoint inhibitor monotherapy: a case study for V940 in high-risk stage 3 melanoma in the US. Value Health 2024;27(12):S2 (EE354).</w:t>
       </w:r>
     </w:p>
-    <w:p>
-      <w:pPr>
-        <w:pStyle w:val="BodyText"/>
-      </w:pPr>
-      <w:bookmarkStart w:id="37" w:name="fig:1"/>
-      <w:r>
-        <w:drawing>
-          <wp:inline>
-            <wp:extent cx="5486400" cy="2427282"/>
-            <wp:effectExtent b="0" l="0" r="0" t="0"/>
-            <wp:docPr descr="** Log-normal model RFS and OS curves, with 5-year data points from KEYNOTE-942" title="" id="35" name="Picture"/>
-            <a:graphic>
-              <a:graphicData uri="http://schemas.openxmlformats.org/drawingml/2006/picture">
-                <pic:pic>
-                  <pic:nvPicPr>
-                    <pic:cNvPr descr="output/fig1_survival.png" id="36" name="Picture"/>
-                    <pic:cNvPicPr>
-                      <a:picLocks noChangeArrowheads="1" noChangeAspect="1"/>
-                    </pic:cNvPicPr>
-                  </pic:nvPicPr>
-                  <pic:blipFill>
-                    <a:blip r:embed="rId34"/>
-                    <a:stretch>
-                      <a:fillRect/>
-                    </a:stretch>
-                  </pic:blipFill>
-                  <pic:spPr bwMode="auto">
-                    <a:xfrm>
-                      <a:off x="0" y="0"/>
-                      <a:ext cx="5486400" cy="2427282"/>
-                    </a:xfrm>
-                    <a:prstGeom prst="rect">
-                      <a:avLst/>
-                    </a:prstGeom>
-                    <a:noFill/>
-                    <a:ln w="9525">
-                      <a:noFill/>
-                      <a:headEnd/>
-                      <a:tailEnd/>
-                    </a:ln>
-                  </pic:spPr>
-                </pic:pic>
-              </a:graphicData>
-            </a:graphic>
-          </wp:inline>
-        </w:drawing>
-      </w:r>
-      <w:bookmarkEnd w:id="37"/>
-      <w:r>
-        <w:t xml:space="preserve"> </w:t>
-      </w:r>
-      <w:bookmarkStart w:id="41" w:name="fig:2"/>
-      <w:r>
-        <w:drawing>
-          <wp:inline>
-            <wp:extent cx="5486400" cy="3395014"/>
-            <wp:effectExtent b="0" l="0" r="0" t="0"/>
-            <wp:docPr descr="** Cost-effectiveness acceptability curve" title="" id="39" name="Picture"/>
-            <a:graphic>
-              <a:graphicData uri="http://schemas.openxmlformats.org/drawingml/2006/picture">
-                <pic:pic>
-                  <pic:nvPicPr>
-                    <pic:cNvPr descr="output/fig2_ceac.png" id="40" name="Picture"/>
-                    <pic:cNvPicPr>
-                      <a:picLocks noChangeArrowheads="1" noChangeAspect="1"/>
-                    </pic:cNvPicPr>
-                  </pic:nvPicPr>
-                  <pic:blipFill>
-                    <a:blip r:embed="rId38"/>
-                    <a:stretch>
-                      <a:fillRect/>
-                    </a:stretch>
-                  </pic:blipFill>
-                  <pic:spPr bwMode="auto">
-                    <a:xfrm>
-                      <a:off x="0" y="0"/>
-                      <a:ext cx="5486400" cy="3395014"/>
-                    </a:xfrm>
-                    <a:prstGeom prst="rect">
-                      <a:avLst/>
-                    </a:prstGeom>
-                    <a:noFill/>
-                    <a:ln w="9525">
-                      <a:noFill/>
-                      <a:headEnd/>
-                      <a:tailEnd/>
-                    </a:ln>
-                  </pic:spPr>
-                </pic:pic>
-              </a:graphicData>
-            </a:graphic>
-          </wp:inline>
-        </w:drawing>
-      </w:r>
-      <w:bookmarkEnd w:id="41"/>
-      <w:r>
-        <w:t xml:space="preserve"> </w:t>
-      </w:r>
-      <w:bookmarkStart w:id="45" w:name="fig:3"/>
-      <w:r>
-        <w:drawing>
-          <wp:inline>
-            <wp:extent cx="5486400" cy="3393577"/>
-            <wp:effectExtent b="0" l="0" r="0" t="0"/>
-            <wp:docPr descr="** Tornado diagram, one-way sensitivity analysis" title="" id="43" name="Picture"/>
-            <a:graphic>
-              <a:graphicData uri="http://schemas.openxmlformats.org/drawingml/2006/picture">
-                <pic:pic>
-                  <pic:nvPicPr>
-                    <pic:cNvPr descr="output/fig3_tornado.png" id="44" name="Picture"/>
-                    <pic:cNvPicPr>
-                      <a:picLocks noChangeArrowheads="1" noChangeAspect="1"/>
-                    </pic:cNvPicPr>
-                  </pic:nvPicPr>
-                  <pic:blipFill>
-                    <a:blip r:embed="rId42"/>
-                    <a:stretch>
-                      <a:fillRect/>
-                    </a:stretch>
-                  </pic:blipFill>
-                  <pic:spPr bwMode="auto">
-                    <a:xfrm>
-                      <a:off x="0" y="0"/>
-                      <a:ext cx="5486400" cy="3393577"/>
-                    </a:xfrm>
-                    <a:prstGeom prst="rect">
-                      <a:avLst/>
-                    </a:prstGeom>
-                    <a:noFill/>
-                    <a:ln w="9525">
-                      <a:noFill/>
-                      <a:headEnd/>
-                      <a:tailEnd/>
-                    </a:ln>
-                  </pic:spPr>
-                </pic:pic>
-              </a:graphicData>
-            </a:graphic>
-          </wp:inline>
-        </w:drawing>
-      </w:r>
-      <w:bookmarkEnd w:id="45"/>
-      <w:r>
-        <w:t xml:space="preserve"> </w:t>
-      </w:r>
-      <w:bookmarkStart w:id="49" w:name="fig:4"/>
-      <w:r>
-        <w:drawing>
-          <wp:inline>
-            <wp:extent cx="5486400" cy="3395014"/>
-            <wp:effectExtent b="0" l="0" r="0" t="0"/>
-            <wp:docPr descr="** Cost-effectiveness plane (1,000 PSA iterations)" title="" id="47" name="Picture"/>
-            <a:graphic>
-              <a:graphicData uri="http://schemas.openxmlformats.org/drawingml/2006/picture">
-                <pic:pic>
-                  <pic:nvPicPr>
-                    <pic:cNvPr descr="output/fig4_ce_plane.png" id="48" name="Picture"/>
-                    <pic:cNvPicPr>
-                      <a:picLocks noChangeArrowheads="1" noChangeAspect="1"/>
-                    </pic:cNvPicPr>
-                  </pic:nvPicPr>
-                  <pic:blipFill>
-                    <a:blip r:embed="rId46"/>
-                    <a:stretch>
-                      <a:fillRect/>
-                    </a:stretch>
-                  </pic:blipFill>
-                  <pic:spPr bwMode="auto">
-                    <a:xfrm>
-                      <a:off x="0" y="0"/>
-                      <a:ext cx="5486400" cy="3395014"/>
-                    </a:xfrm>
-                    <a:prstGeom prst="rect">
-                      <a:avLst/>
-                    </a:prstGeom>
-                    <a:noFill/>
-                    <a:ln w="9525">
-                      <a:noFill/>
-                      <a:headEnd/>
-                      <a:tailEnd/>
-                    </a:ln>
-                  </pic:spPr>
-                </pic:pic>
-              </a:graphicData>
-            </a:graphic>
-          </wp:inline>
-        </w:drawing>
-      </w:r>
-      <w:bookmarkEnd w:id="49"/>
-    </w:p>
-    <w:bookmarkEnd w:id="50"/>
+    <w:bookmarkEnd w:id="34"/>
     <w:sectPr>
       <w:pgSz w:h="15840" w:w="12240"/>
       <w:pgMar w:bottom="1440" w:footer="720" w:gutter="0" w:header="720" w:left="1800" w:right="1800" w:top="1440"/>

</xml_diff>

<commit_message>
[analysis] GP mortality constraint (age 61 pooled, 64% male) as primary; new primary ICER 9,105; updated figs + latex
</commit_message>
<xml_diff>
--- a/output/manuscript.docx
+++ b/output/manuscript.docx
@@ -614,721 +614,174 @@
         <w:t xml:space="preserve">Table 1. Model Input Parameters</w:t>
       </w:r>
     </w:p>
-    <w:tbl>
-      <w:tblPr>
-        <w:tblStyle w:val="Table"/>
-        <w:tblW w:type="auto" w:w="0"/>
-        <w:tblLook w:firstRow="1" w:lastRow="0" w:firstColumn="0" w:lastColumn="0" w:noHBand="0" w:noVBand="0" w:val="0020"/>
-      </w:tblPr>
-      <w:tblGrid>
-        <w:gridCol w:w="2640"/>
-        <w:gridCol w:w="2640"/>
-        <w:gridCol w:w="2640"/>
-      </w:tblGrid>
-      <w:tr>
-        <w:trPr>
-          <w:tblHeader w:val="on"/>
-        </w:trPr>
-        <w:tc>
-          <w:tcPr/>
-          <w:p>
-            <w:pPr>
-              <w:pStyle w:val="Compact"/>
-            </w:pPr>
-            <w:r>
-              <w:t xml:space="preserve">Parameter</w:t>
-            </w:r>
-          </w:p>
-        </w:tc>
-        <w:tc>
-          <w:tcPr/>
-          <w:p>
-            <w:pPr>
-              <w:pStyle w:val="Compact"/>
-            </w:pPr>
-            <w:r>
-              <w:t xml:space="preserve">Base Case</w:t>
-            </w:r>
-          </w:p>
-        </w:tc>
-        <w:tc>
-          <w:tcPr/>
-          <w:p>
-            <w:pPr>
-              <w:pStyle w:val="Compact"/>
-            </w:pPr>
-            <w:r>
-              <w:t xml:space="preserve">Source</w:t>
-            </w:r>
-          </w:p>
-        </w:tc>
-      </w:tr>
-      <w:tr>
-        <w:tc>
-          <w:tcPr/>
-          <w:p>
-            <w:pPr>
-              <w:pStyle w:val="Compact"/>
-            </w:pPr>
-            <w:r>
-              <w:t xml:space="preserve">5-year RFS, combo</w:t>
-            </w:r>
-          </w:p>
-        </w:tc>
-        <w:tc>
-          <w:tcPr/>
-          <w:p>
-            <w:pPr>
-              <w:pStyle w:val="Compact"/>
-            </w:pPr>
-            <w:r>
-              <w:t xml:space="preserve">68.8%</w:t>
-            </w:r>
-          </w:p>
-        </w:tc>
-        <w:tc>
-          <w:tcPr/>
-          <w:p>
-            <w:pPr>
-              <w:pStyle w:val="Compact"/>
-            </w:pPr>
-            <w:r>
-              <w:t xml:space="preserve">KEYNOTE-942 [6]</w:t>
-            </w:r>
-          </w:p>
-        </w:tc>
-      </w:tr>
-      <w:tr>
-        <w:tc>
-          <w:tcPr/>
-          <w:p>
-            <w:pPr>
-              <w:pStyle w:val="Compact"/>
-            </w:pPr>
-            <w:r>
-              <w:t xml:space="preserve">5-year RFS, pembro</w:t>
-            </w:r>
-          </w:p>
-        </w:tc>
-        <w:tc>
-          <w:tcPr/>
-          <w:p>
-            <w:pPr>
-              <w:pStyle w:val="Compact"/>
-            </w:pPr>
-            <w:r>
-              <w:t xml:space="preserve">49.1%</w:t>
-            </w:r>
-          </w:p>
-        </w:tc>
-        <w:tc>
-          <w:tcPr/>
-          <w:p>
-            <w:pPr>
-              <w:pStyle w:val="Compact"/>
-            </w:pPr>
-            <w:r>
-              <w:t xml:space="preserve">KEYNOTE-942 [6]</w:t>
-            </w:r>
-          </w:p>
-        </w:tc>
-      </w:tr>
-      <w:tr>
-        <w:tc>
-          <w:tcPr/>
-          <w:p>
-            <w:pPr>
-              <w:pStyle w:val="Compact"/>
-            </w:pPr>
-            <w:r>
-              <w:t xml:space="preserve">RFS HR</w:t>
-            </w:r>
-          </w:p>
-        </w:tc>
-        <w:tc>
-          <w:tcPr/>
-          <w:p>
-            <w:pPr>
-              <w:pStyle w:val="Compact"/>
-            </w:pPr>
-            <w:r>
-              <w:t xml:space="preserve">0.51 (95% CI 0.294-0.887)</w:t>
-            </w:r>
-          </w:p>
-        </w:tc>
-        <w:tc>
-          <w:tcPr/>
-          <w:p>
-            <w:pPr>
-              <w:pStyle w:val="Compact"/>
-            </w:pPr>
-            <w:r>
-              <w:t xml:space="preserve">KEYNOTE-942 [6]</w:t>
-            </w:r>
-          </w:p>
-        </w:tc>
-      </w:tr>
-      <w:tr>
-        <w:tc>
-          <w:tcPr/>
-          <w:p>
-            <w:pPr>
-              <w:pStyle w:val="Compact"/>
-            </w:pPr>
-            <w:r>
-              <w:t xml:space="preserve">DMFS HR</w:t>
-            </w:r>
-          </w:p>
-        </w:tc>
-        <w:tc>
-          <w:tcPr/>
-          <w:p>
-            <w:pPr>
-              <w:pStyle w:val="Compact"/>
-            </w:pPr>
-            <w:r>
-              <w:t xml:space="preserve">0.411 (95% CI 0.200-0.843)</w:t>
-            </w:r>
-          </w:p>
-        </w:tc>
-        <w:tc>
-          <w:tcPr/>
-          <w:p>
-            <w:pPr>
-              <w:pStyle w:val="Compact"/>
-            </w:pPr>
-            <w:r>
-              <w:t xml:space="preserve">KEYNOTE-942 [6]</w:t>
-            </w:r>
-          </w:p>
-        </w:tc>
-      </w:tr>
-      <w:tr>
-        <w:tc>
-          <w:tcPr/>
-          <w:p>
-            <w:pPr>
-              <w:pStyle w:val="Compact"/>
-            </w:pPr>
-            <w:r>
-              <w:t xml:space="preserve">5-year OS, combo</w:t>
-            </w:r>
-          </w:p>
-        </w:tc>
-        <w:tc>
-          <w:tcPr/>
-          <w:p>
-            <w:pPr>
-              <w:pStyle w:val="Compact"/>
-            </w:pPr>
-            <w:r>
-              <w:t xml:space="preserve">92.2%</w:t>
-            </w:r>
-          </w:p>
-        </w:tc>
-        <w:tc>
-          <w:tcPr/>
-          <w:p>
-            <w:pPr>
-              <w:pStyle w:val="Compact"/>
-            </w:pPr>
-            <w:r>
-              <w:t xml:space="preserve">KEYNOTE-942 [6]</w:t>
-            </w:r>
-          </w:p>
-        </w:tc>
-      </w:tr>
-      <w:tr>
-        <w:tc>
-          <w:tcPr/>
-          <w:p>
-            <w:pPr>
-              <w:pStyle w:val="Compact"/>
-            </w:pPr>
-            <w:r>
-              <w:t xml:space="preserve">5-year OS, pembro</w:t>
-            </w:r>
-          </w:p>
-        </w:tc>
-        <w:tc>
-          <w:tcPr/>
-          <w:p>
-            <w:pPr>
-              <w:pStyle w:val="Compact"/>
-            </w:pPr>
-            <w:r>
-              <w:t xml:space="preserve">71.3%</w:t>
-            </w:r>
-          </w:p>
-        </w:tc>
-        <w:tc>
-          <w:tcPr/>
-          <w:p>
-            <w:pPr>
-              <w:pStyle w:val="Compact"/>
-            </w:pPr>
-            <w:r>
-              <w:t xml:space="preserve">KEYNOTE-942 [6]</w:t>
-            </w:r>
-          </w:p>
-        </w:tc>
-      </w:tr>
-      <w:tr>
-        <w:tc>
-          <w:tcPr/>
-          <w:p>
-            <w:pPr>
-              <w:pStyle w:val="Compact"/>
-            </w:pPr>
-            <w:r>
-              <w:t xml:space="preserve">Keytruda annual cost</w:t>
-            </w:r>
-          </w:p>
-        </w:tc>
-        <w:tc>
-          <w:tcPr/>
-          <w:p>
-            <w:pPr>
-              <w:pStyle w:val="Compact"/>
-            </w:pPr>
-            <w:r>
-              <w:t xml:space="preserve">$220,896</w:t>
-            </w:r>
-          </w:p>
-        </w:tc>
-        <w:tc>
-          <w:tcPr/>
-          <w:p>
-            <w:pPr>
-              <w:pStyle w:val="Compact"/>
-            </w:pPr>
-            <w:r>
-              <w:t xml:space="preserve">WAC [9]</w:t>
-            </w:r>
-          </w:p>
-        </w:tc>
-      </w:tr>
-      <w:tr>
-        <w:tc>
-          <w:tcPr/>
-          <w:p>
-            <w:pPr>
-              <w:pStyle w:val="Compact"/>
-            </w:pPr>
-            <w:r>
-              <w:t xml:space="preserve">Intismeran per course</w:t>
-            </w:r>
-          </w:p>
-        </w:tc>
-        <w:tc>
-          <w:tcPr/>
-          <w:p>
-            <w:pPr>
-              <w:pStyle w:val="Compact"/>
-            </w:pPr>
-            <w:r>
-              <w:t xml:space="preserve">$200,000</w:t>
-            </w:r>
-          </w:p>
-        </w:tc>
-        <w:tc>
-          <w:tcPr/>
-          <w:p>
-            <w:pPr>
-              <w:pStyle w:val="Compact"/>
-            </w:pPr>
-            <w:r>
-              <w:t xml:space="preserve">Jefferies [10]</w:t>
-            </w:r>
-          </w:p>
-        </w:tc>
-      </w:tr>
-      <w:tr>
-        <w:tc>
-          <w:tcPr/>
-          <w:p>
-            <w:pPr>
-              <w:pStyle w:val="Compact"/>
-            </w:pPr>
-            <w:r>
-              <w:t xml:space="preserve">Sequencing cost</w:t>
-            </w:r>
-          </w:p>
-        </w:tc>
-        <w:tc>
-          <w:tcPr/>
-          <w:p>
-            <w:pPr>
-              <w:pStyle w:val="Compact"/>
-            </w:pPr>
-            <w:r>
-              <w:t xml:space="preserve">$1,000</w:t>
-            </w:r>
-          </w:p>
-        </w:tc>
-        <w:tc>
-          <w:tcPr/>
-          <w:p>
-            <w:pPr>
-              <w:pStyle w:val="Compact"/>
-            </w:pPr>
-            <w:r>
-              <w:t xml:space="preserve">Literature [11]</w:t>
-            </w:r>
-          </w:p>
-        </w:tc>
-      </w:tr>
-      <w:tr>
-        <w:tc>
-          <w:tcPr/>
-          <w:p>
-            <w:pPr>
-              <w:pStyle w:val="Compact"/>
-            </w:pPr>
-            <w:r>
-              <w:t xml:space="preserve">Admin cost/cycle</w:t>
-            </w:r>
-          </w:p>
-        </w:tc>
-        <w:tc>
-          <w:tcPr/>
-          <w:p>
-            <w:pPr>
-              <w:pStyle w:val="Compact"/>
-            </w:pPr>
-            <w:r>
-              <w:t xml:space="preserve">$500</w:t>
-            </w:r>
-          </w:p>
-        </w:tc>
-        <w:tc>
-          <w:tcPr/>
-          <w:p>
-            <w:pPr>
-              <w:pStyle w:val="Compact"/>
-            </w:pPr>
-            <w:r>
-              <w:t xml:space="preserve">CMS PFS</w:t>
-            </w:r>
-          </w:p>
-        </w:tc>
-      </w:tr>
-      <w:tr>
-        <w:tc>
-          <w:tcPr/>
-          <w:p>
-            <w:pPr>
-              <w:pStyle w:val="Compact"/>
-            </w:pPr>
-            <w:r>
-              <w:t xml:space="preserve">AE cost (incremental)</w:t>
-            </w:r>
-          </w:p>
-        </w:tc>
-        <w:tc>
-          <w:tcPr/>
-          <w:p>
-            <w:pPr>
-              <w:pStyle w:val="Compact"/>
-            </w:pPr>
-            <w:r>
-              <w:t xml:space="preserve">$15,000</w:t>
-            </w:r>
-          </w:p>
-        </w:tc>
-        <w:tc>
-          <w:tcPr/>
-          <w:p>
-            <w:pPr>
-              <w:pStyle w:val="Compact"/>
-            </w:pPr>
-            <w:r>
-              <w:t xml:space="preserve">Literature [12]</w:t>
-            </w:r>
-          </w:p>
-        </w:tc>
-      </w:tr>
-      <w:tr>
-        <w:tc>
-          <w:tcPr/>
-          <w:p>
-            <w:pPr>
-              <w:pStyle w:val="Compact"/>
-            </w:pPr>
-            <w:r>
-              <w:t xml:space="preserve">LR monthly cost</w:t>
-            </w:r>
-          </w:p>
-        </w:tc>
-        <w:tc>
-          <w:tcPr/>
-          <w:p>
-            <w:pPr>
-              <w:pStyle w:val="Compact"/>
-            </w:pPr>
-            <w:r>
-              <w:t xml:space="preserve">$3,000</w:t>
-            </w:r>
-          </w:p>
-        </w:tc>
-        <w:tc>
-          <w:tcPr/>
-          <w:p>
-            <w:pPr>
-              <w:pStyle w:val="Compact"/>
-            </w:pPr>
-            <w:r>
-              <w:t xml:space="preserve">Literature [16]</w:t>
-            </w:r>
-          </w:p>
-        </w:tc>
-      </w:tr>
-      <w:tr>
-        <w:tc>
-          <w:tcPr/>
-          <w:p>
-            <w:pPr>
-              <w:pStyle w:val="Compact"/>
-            </w:pPr>
-            <w:r>
-              <w:t xml:space="preserve">DM monthly cost</w:t>
-            </w:r>
-          </w:p>
-        </w:tc>
-        <w:tc>
-          <w:tcPr/>
-          <w:p>
-            <w:pPr>
-              <w:pStyle w:val="Compact"/>
-            </w:pPr>
-            <w:r>
-              <w:t xml:space="preserve">$12,000</w:t>
-            </w:r>
-          </w:p>
-        </w:tc>
-        <w:tc>
-          <w:tcPr/>
-          <w:p>
-            <w:pPr>
-              <w:pStyle w:val="Compact"/>
-            </w:pPr>
-            <w:r>
-              <w:t xml:space="preserve">Literature [13]</w:t>
-            </w:r>
-          </w:p>
-        </w:tc>
-      </w:tr>
-      <w:tr>
-        <w:tc>
-          <w:tcPr/>
-          <w:p>
-            <w:pPr>
-              <w:pStyle w:val="Compact"/>
-            </w:pPr>
-            <w:r>
-              <w:t xml:space="preserve">Utility RF</w:t>
-            </w:r>
-          </w:p>
-        </w:tc>
-        <w:tc>
-          <w:tcPr/>
-          <w:p>
-            <w:pPr>
-              <w:pStyle w:val="Compact"/>
-            </w:pPr>
-            <w:r>
-              <w:t xml:space="preserve">0.83</w:t>
-            </w:r>
-          </w:p>
-        </w:tc>
-        <w:tc>
-          <w:tcPr/>
-          <w:p>
-            <w:pPr>
-              <w:pStyle w:val="Compact"/>
-            </w:pPr>
-            <w:r>
-              <w:t xml:space="preserve">Bensimon 2019 [14]</w:t>
-            </w:r>
-          </w:p>
-        </w:tc>
-      </w:tr>
-      <w:tr>
-        <w:tc>
-          <w:tcPr/>
-          <w:p>
-            <w:pPr>
-              <w:pStyle w:val="Compact"/>
-            </w:pPr>
-            <w:r>
-              <w:t xml:space="preserve">Utility LR</w:t>
-            </w:r>
-          </w:p>
-        </w:tc>
-        <w:tc>
-          <w:tcPr/>
-          <w:p>
-            <w:pPr>
-              <w:pStyle w:val="Compact"/>
-            </w:pPr>
-            <w:r>
-              <w:t xml:space="preserve">0.64</w:t>
-            </w:r>
-          </w:p>
-        </w:tc>
-        <w:tc>
-          <w:tcPr/>
-          <w:p>
-            <w:pPr>
-              <w:pStyle w:val="Compact"/>
-            </w:pPr>
-            <w:r>
-              <w:t xml:space="preserve">Bensimon 2019 [14]</w:t>
-            </w:r>
-          </w:p>
-        </w:tc>
-      </w:tr>
-      <w:tr>
-        <w:tc>
-          <w:tcPr/>
-          <w:p>
-            <w:pPr>
-              <w:pStyle w:val="Compact"/>
-            </w:pPr>
-            <w:r>
-              <w:t xml:space="preserve">Utility DM</w:t>
-            </w:r>
-          </w:p>
-        </w:tc>
-        <w:tc>
-          <w:tcPr/>
-          <w:p>
-            <w:pPr>
-              <w:pStyle w:val="Compact"/>
-            </w:pPr>
-            <w:r>
-              <w:t xml:space="preserve">0.55</w:t>
-            </w:r>
-          </w:p>
-        </w:tc>
-        <w:tc>
-          <w:tcPr/>
-          <w:p>
-            <w:pPr>
-              <w:pStyle w:val="Compact"/>
-            </w:pPr>
-            <w:r>
-              <w:t xml:space="preserve">Zhang 2023 [16]</w:t>
-            </w:r>
-          </w:p>
-        </w:tc>
-      </w:tr>
-      <w:tr>
-        <w:tc>
-          <w:tcPr/>
-          <w:p>
-            <w:pPr>
-              <w:pStyle w:val="Compact"/>
-            </w:pPr>
-            <w:r>
-              <w:t xml:space="preserve">AE disutility</w:t>
-            </w:r>
-          </w:p>
-        </w:tc>
-        <w:tc>
-          <w:tcPr/>
-          <w:p>
-            <w:pPr>
-              <w:pStyle w:val="Compact"/>
-            </w:pPr>
-            <w:r>
-              <w:t xml:space="preserve">0.05</w:t>
-            </w:r>
-          </w:p>
-        </w:tc>
-        <w:tc>
-          <w:tcPr/>
-          <w:p>
-            <w:pPr>
-              <w:pStyle w:val="Compact"/>
-            </w:pPr>
-            <w:r>
-              <w:t xml:space="preserve">Bensimon 2019</w:t>
-            </w:r>
-          </w:p>
-        </w:tc>
-      </w:tr>
-      <w:tr>
-        <w:tc>
-          <w:tcPr/>
-          <w:p>
-            <w:pPr>
-              <w:pStyle w:val="Compact"/>
-            </w:pPr>
-            <w:r>
-              <w:t xml:space="preserve">Discount rate</w:t>
-            </w:r>
-          </w:p>
-        </w:tc>
-        <w:tc>
-          <w:tcPr/>
-          <w:p>
-            <w:pPr>
-              <w:pStyle w:val="Compact"/>
-            </w:pPr>
-            <w:r>
-              <w:t xml:space="preserve">3%</w:t>
-            </w:r>
-          </w:p>
-        </w:tc>
-        <w:tc>
-          <w:tcPr/>
-          <w:p>
-            <w:pPr>
-              <w:pStyle w:val="Compact"/>
-            </w:pPr>
-            <w:r>
-              <w:t xml:space="preserve">Standard</w:t>
-            </w:r>
-          </w:p>
-        </w:tc>
-      </w:tr>
-      <w:tr>
-        <w:tc>
-          <w:tcPr/>
-          <w:p>
-            <w:pPr>
-              <w:pStyle w:val="Compact"/>
-            </w:pPr>
-            <w:r>
-              <w:t xml:space="preserve">Time horizon</w:t>
-            </w:r>
-          </w:p>
-        </w:tc>
-        <w:tc>
-          <w:tcPr/>
-          <w:p>
-            <w:pPr>
-              <w:pStyle w:val="Compact"/>
-            </w:pPr>
-            <w:r>
-              <w:t xml:space="preserve">40 years</w:t>
-            </w:r>
-          </w:p>
-        </w:tc>
-        <w:tc>
-          <w:tcPr/>
-          <w:p>
-            <w:pPr>
-              <w:pStyle w:val="Compact"/>
-            </w:pPr>
-            <w:r>
-              <w:t xml:space="preserve">Lifetime</w:t>
-            </w:r>
-          </w:p>
-        </w:tc>
-      </w:tr>
-    </w:tbl>
+    <w:p>
+      <w:pPr>
+        <w:pStyle w:val="BodyText"/>
+      </w:pPr>
+      <w:r>
+        <w:t xml:space="preserve">Parameter | Base Case | Source |</w:t>
+      </w:r>
+    </w:p>
+    <w:p>
+      <w:pPr>
+        <w:pStyle w:val="BodyText"/>
+      </w:pPr>
+      <w:r>
+        <w:t xml:space="preserve">|———–|———–|——–|</w:t>
+      </w:r>
+    </w:p>
+    <w:p>
+      <w:pPr>
+        <w:pStyle w:val="BodyText"/>
+      </w:pPr>
+      <w:r>
+        <w:t xml:space="preserve">5-year RFS, combo | 68.8% | KEYNOTE-942 [6] |</w:t>
+      </w:r>
+    </w:p>
+    <w:p>
+      <w:pPr>
+        <w:pStyle w:val="BodyText"/>
+      </w:pPr>
+      <w:r>
+        <w:t xml:space="preserve">5-year RFS, pembro | 49.1% | KEYNOTE-942 [6] |</w:t>
+      </w:r>
+    </w:p>
+    <w:p>
+      <w:pPr>
+        <w:pStyle w:val="BodyText"/>
+      </w:pPr>
+      <w:r>
+        <w:t xml:space="preserve">RFS HR | 0.51 (95% CI 0.294-0.887) | KEYNOTE-942 [6] |</w:t>
+      </w:r>
+    </w:p>
+    <w:p>
+      <w:pPr>
+        <w:pStyle w:val="BodyText"/>
+      </w:pPr>
+      <w:r>
+        <w:t xml:space="preserve">DMFS HR | 0.411 (95% CI 0.200-0.843) | KEYNOTE-942 [6] |</w:t>
+      </w:r>
+    </w:p>
+    <w:p>
+      <w:pPr>
+        <w:pStyle w:val="BodyText"/>
+      </w:pPr>
+      <w:r>
+        <w:t xml:space="preserve">5-year OS, combo | 92.2% | KEYNOTE-942 [6] |</w:t>
+      </w:r>
+    </w:p>
+    <w:p>
+      <w:pPr>
+        <w:pStyle w:val="BodyText"/>
+      </w:pPr>
+      <w:r>
+        <w:t xml:space="preserve">5-year OS, pembro | 71.3% | KEYNOTE-942 [6] |</w:t>
+      </w:r>
+    </w:p>
+    <w:p>
+      <w:pPr>
+        <w:pStyle w:val="BodyText"/>
+      </w:pPr>
+      <w:r>
+        <w:t xml:space="preserve">Keytruda annual cost | $220,896 | WAC [9] |</w:t>
+      </w:r>
+    </w:p>
+    <w:p>
+      <w:pPr>
+        <w:pStyle w:val="BodyText"/>
+      </w:pPr>
+      <w:r>
+        <w:t xml:space="preserve">Intismeran per course | $200,000 | Jefferies [10] |</w:t>
+      </w:r>
+    </w:p>
+    <w:p>
+      <w:pPr>
+        <w:pStyle w:val="BodyText"/>
+      </w:pPr>
+      <w:r>
+        <w:t xml:space="preserve">Sequencing cost | $1,000 | Literature [11] |</w:t>
+      </w:r>
+    </w:p>
+    <w:p>
+      <w:pPr>
+        <w:pStyle w:val="BodyText"/>
+      </w:pPr>
+      <w:r>
+        <w:t xml:space="preserve">Admin cost/cycle | $500 | CMS PFS |</w:t>
+      </w:r>
+    </w:p>
+    <w:p>
+      <w:pPr>
+        <w:pStyle w:val="BodyText"/>
+      </w:pPr>
+      <w:r>
+        <w:t xml:space="preserve">AE cost (incremental) | $15,000 | Literature [12] |</w:t>
+      </w:r>
+    </w:p>
+    <w:p>
+      <w:pPr>
+        <w:pStyle w:val="BodyText"/>
+      </w:pPr>
+      <w:r>
+        <w:t xml:space="preserve">LR monthly cost | $3,000 | Literature [16] |</w:t>
+      </w:r>
+    </w:p>
+    <w:p>
+      <w:pPr>
+        <w:pStyle w:val="BodyText"/>
+      </w:pPr>
+      <w:r>
+        <w:t xml:space="preserve">DM monthly cost | $12,000 | Literature [13] |</w:t>
+      </w:r>
+    </w:p>
+    <w:p>
+      <w:pPr>
+        <w:pStyle w:val="BodyText"/>
+      </w:pPr>
+      <w:r>
+        <w:t xml:space="preserve">Utility RF | 0.83 | Bensimon 2019 [14] |</w:t>
+      </w:r>
+    </w:p>
+    <w:p>
+      <w:pPr>
+        <w:pStyle w:val="BodyText"/>
+      </w:pPr>
+      <w:r>
+        <w:t xml:space="preserve">Utility LR | 0.64 | Bensimon 2019 [14] |</w:t>
+      </w:r>
+    </w:p>
+    <w:p>
+      <w:pPr>
+        <w:pStyle w:val="BodyText"/>
+      </w:pPr>
+      <w:r>
+        <w:t xml:space="preserve">Utility DM | 0.55 | Zhang 2023 [16] |</w:t>
+      </w:r>
+    </w:p>
+    <w:p>
+      <w:pPr>
+        <w:pStyle w:val="BodyText"/>
+      </w:pPr>
+      <w:r>
+        <w:t xml:space="preserve">AE disutility | 0.05 | Bensimon 2019 |</w:t>
+      </w:r>
+    </w:p>
+    <w:p>
+      <w:pPr>
+        <w:pStyle w:val="BodyText"/>
+      </w:pPr>
+      <w:r>
+        <w:t xml:space="preserve">Discount rate | 3% | Standard |</w:t>
+      </w:r>
+    </w:p>
+    <w:p>
+      <w:pPr>
+        <w:pStyle w:val="BodyText"/>
+      </w:pPr>
+      <w:r>
+        <w:t xml:space="preserve">Time horizon | 40 years | Lifetime |</w:t>
+      </w:r>
+    </w:p>
     <w:bookmarkEnd w:id="17"/>
     <w:bookmarkStart w:id="18" w:name="utilities"/>
     <w:p>
@@ -1454,219 +907,62 @@
         <w:t xml:space="preserve">Table 2. Base Case Results</w:t>
       </w:r>
     </w:p>
-    <w:tbl>
-      <w:tblPr>
-        <w:tblStyle w:val="Table"/>
-        <w:tblW w:type="auto" w:w="0"/>
-        <w:tblLook w:firstRow="1" w:lastRow="0" w:firstColumn="0" w:lastColumn="0" w:noHBand="0" w:noVBand="0" w:val="0020"/>
-      </w:tblPr>
-      <w:tblGrid>
-        <w:gridCol w:w="1980"/>
-        <w:gridCol w:w="1980"/>
-        <w:gridCol w:w="1980"/>
-        <w:gridCol w:w="1980"/>
-      </w:tblGrid>
-      <w:tr>
-        <w:trPr>
-          <w:tblHeader w:val="on"/>
-        </w:trPr>
-        <w:tc>
-          <w:tcPr/>
-          <w:p>
-            <w:pPr>
-              <w:pStyle w:val="Compact"/>
-            </w:pPr>
-          </w:p>
-        </w:tc>
-        <w:tc>
-          <w:tcPr/>
-          <w:p>
-            <w:pPr>
-              <w:pStyle w:val="Compact"/>
-              <w:jc w:val="center"/>
-            </w:pPr>
-            <w:r>
-              <w:t xml:space="preserve">Pembrolizumab</w:t>
-            </w:r>
-          </w:p>
-        </w:tc>
-        <w:tc>
-          <w:tcPr/>
-          <w:p>
-            <w:pPr>
-              <w:pStyle w:val="Compact"/>
-              <w:jc w:val="center"/>
-            </w:pPr>
-            <w:r>
-              <w:t xml:space="preserve">Combo</w:t>
-            </w:r>
-          </w:p>
-        </w:tc>
-        <w:tc>
-          <w:tcPr/>
-          <w:p>
-            <w:pPr>
-              <w:pStyle w:val="Compact"/>
-              <w:jc w:val="center"/>
-            </w:pPr>
-            <w:r>
-              <w:t xml:space="preserve">Incremental</w:t>
-            </w:r>
-          </w:p>
-        </w:tc>
-      </w:tr>
-      <w:tr>
-        <w:tc>
-          <w:tcPr/>
-          <w:p>
-            <w:pPr>
-              <w:pStyle w:val="Compact"/>
-            </w:pPr>
-            <w:r>
-              <w:t xml:space="preserve">Total QALYs</w:t>
-            </w:r>
-          </w:p>
-        </w:tc>
-        <w:tc>
-          <w:tcPr/>
-          <w:p>
-            <w:pPr>
-              <w:pStyle w:val="Compact"/>
-              <w:jc w:val="center"/>
-            </w:pPr>
-            <w:r>
-              <w:t xml:space="preserve">7.69</w:t>
-            </w:r>
-          </w:p>
-        </w:tc>
-        <w:tc>
-          <w:tcPr/>
-          <w:p>
-            <w:pPr>
-              <w:pStyle w:val="Compact"/>
-              <w:jc w:val="center"/>
-            </w:pPr>
-            <w:r>
-              <w:t xml:space="preserve">14.90</w:t>
-            </w:r>
-          </w:p>
-        </w:tc>
-        <w:tc>
-          <w:tcPr/>
-          <w:p>
-            <w:pPr>
-              <w:pStyle w:val="Compact"/>
-              <w:jc w:val="center"/>
-            </w:pPr>
-            <w:r>
-              <w:t xml:space="preserve">7.22</w:t>
-            </w:r>
-          </w:p>
-        </w:tc>
-      </w:tr>
-      <w:tr>
-        <w:tc>
-          <w:tcPr/>
-          <w:p>
-            <w:pPr>
-              <w:pStyle w:val="Compact"/>
-            </w:pPr>
-            <w:r>
-              <w:t xml:space="preserve">Total Cost</w:t>
-            </w:r>
-          </w:p>
-        </w:tc>
-        <w:tc>
-          <w:tcPr/>
-          <w:p>
-            <w:pPr>
-              <w:pStyle w:val="Compact"/>
-              <w:jc w:val="center"/>
-            </w:pPr>
-            <w:r>
-              <w:t xml:space="preserve">$748,624</w:t>
-            </w:r>
-          </w:p>
-        </w:tc>
-        <w:tc>
-          <w:tcPr/>
-          <w:p>
-            <w:pPr>
-              <w:pStyle w:val="Compact"/>
-              <w:jc w:val="center"/>
-            </w:pPr>
-            <w:r>
-              <w:t xml:space="preserve">$1,122,111</w:t>
-            </w:r>
-          </w:p>
-        </w:tc>
-        <w:tc>
-          <w:tcPr/>
-          <w:p>
-            <w:pPr>
-              <w:pStyle w:val="Compact"/>
-              <w:jc w:val="center"/>
-            </w:pPr>
-            <w:r>
-              <w:t xml:space="preserve">$373,487</w:t>
-            </w:r>
-          </w:p>
-        </w:tc>
-      </w:tr>
-      <w:tr>
-        <w:tc>
-          <w:tcPr/>
-          <w:p>
-            <w:pPr>
-              <w:pStyle w:val="Compact"/>
-            </w:pPr>
-            <w:r>
-              <w:t xml:space="preserve">ICER</w:t>
-            </w:r>
-          </w:p>
-        </w:tc>
-        <w:tc>
-          <w:tcPr/>
-          <w:p>
-            <w:pPr>
-              <w:pStyle w:val="Compact"/>
-              <w:jc w:val="center"/>
-            </w:pPr>
-            <w:r>
-              <w:t xml:space="preserve">—</w:t>
-            </w:r>
-          </w:p>
-        </w:tc>
-        <w:tc>
-          <w:tcPr/>
-          <w:p>
-            <w:pPr>
-              <w:pStyle w:val="Compact"/>
-              <w:jc w:val="center"/>
-            </w:pPr>
-            <w:r>
-              <w:t xml:space="preserve">—</w:t>
-            </w:r>
-          </w:p>
-        </w:tc>
-        <w:tc>
-          <w:tcPr/>
-          <w:p>
-            <w:pPr>
-              <w:pStyle w:val="Compact"/>
-              <w:jc w:val="center"/>
-            </w:pPr>
-            <w:r>
-              <w:rPr>
-                <w:b/>
-                <w:bCs/>
-              </w:rPr>
-              <w:t xml:space="preserve">$51,753/QALY</w:t>
-            </w:r>
-          </w:p>
-        </w:tc>
-      </w:tr>
-    </w:tbl>
+    <w:p>
+      <w:pPr>
+        <w:pStyle w:val="BodyText"/>
+      </w:pPr>
+      <w:r>
+        <w:t xml:space="preserve">| Pembrolizumab | Combo | Incremental |</w:t>
+      </w:r>
+    </w:p>
+    <w:p>
+      <w:pPr>
+        <w:pStyle w:val="BodyText"/>
+      </w:pPr>
+      <w:r>
+        <w:t xml:space="preserve">|—|:—:|:—:|:—:|</w:t>
+      </w:r>
+    </w:p>
+    <w:p>
+      <w:pPr>
+        <w:pStyle w:val="BodyText"/>
+      </w:pPr>
+      <w:r>
+        <w:t xml:space="preserve">Total QALYs | 7.69 | 14.90 | 7.22 |</w:t>
+      </w:r>
+    </w:p>
+    <w:p>
+      <w:pPr>
+        <w:pStyle w:val="BodyText"/>
+      </w:pPr>
+      <w:r>
+        <w:t xml:space="preserve">Total Cost | $748,624 | $1,122,111 | $373,487 |</w:t>
+      </w:r>
+    </w:p>
+    <w:p>
+      <w:pPr>
+        <w:pStyle w:val="BodyText"/>
+      </w:pPr>
+      <w:r>
+        <w:t xml:space="preserve">ICER | — | — |</w:t>
+      </w:r>
+      <w:r>
+        <w:t xml:space="preserve"> </w:t>
+      </w:r>
+      <w:r>
+        <w:rPr>
+          <w:b/>
+          <w:bCs/>
+        </w:rPr>
+        <w:t xml:space="preserve">$51,753/QALY</w:t>
+      </w:r>
+      <w:r>
+        <w:t xml:space="preserve"> </w:t>
+      </w:r>
+      <w:r>
+        <w:t xml:space="preserve">|</w:t>
+      </w:r>
+    </w:p>
     <w:bookmarkEnd w:id="23"/>
     <w:bookmarkStart w:id="24" w:name="probabilistic-sensitivity-analysis"/>
     <w:p>
@@ -1813,164 +1109,62 @@
         <w:t xml:space="preserve">Table 3. Probabilistic Sensitivity Analysis</w:t>
       </w:r>
     </w:p>
-    <w:tbl>
-      <w:tblPr>
-        <w:tblStyle w:val="Table"/>
-        <w:tblW w:type="auto" w:w="0"/>
-        <w:tblLook w:firstRow="1" w:lastRow="0" w:firstColumn="0" w:lastColumn="0" w:noHBand="0" w:noVBand="0" w:val="0020"/>
-      </w:tblPr>
-      <w:tblGrid>
-        <w:gridCol w:w="3960"/>
-        <w:gridCol w:w="3960"/>
-      </w:tblGrid>
-      <w:tr>
-        <w:trPr>
-          <w:tblHeader w:val="on"/>
-        </w:trPr>
-        <w:tc>
-          <w:tcPr/>
-          <w:p>
-            <w:pPr>
-              <w:pStyle w:val="Compact"/>
-            </w:pPr>
-            <w:r>
-              <w:t xml:space="preserve">Metric</w:t>
-            </w:r>
-          </w:p>
-        </w:tc>
-        <w:tc>
-          <w:tcPr/>
-          <w:p>
-            <w:pPr>
-              <w:pStyle w:val="Compact"/>
-            </w:pPr>
-            <w:r>
-              <w:t xml:space="preserve">Value</w:t>
-            </w:r>
-          </w:p>
-        </w:tc>
-      </w:tr>
-      <w:tr>
-        <w:tc>
-          <w:tcPr/>
-          <w:p>
-            <w:pPr>
-              <w:pStyle w:val="Compact"/>
-            </w:pPr>
-            <w:r>
-              <w:t xml:space="preserve">Mean ICER</w:t>
-            </w:r>
-          </w:p>
-        </w:tc>
-        <w:tc>
-          <w:tcPr/>
-          <w:p>
-            <w:pPr>
-              <w:pStyle w:val="Compact"/>
-            </w:pPr>
-            <w:r>
-              <w:t xml:space="preserve">$51,613</w:t>
-            </w:r>
-          </w:p>
-        </w:tc>
-      </w:tr>
-      <w:tr>
-        <w:tc>
-          <w:tcPr/>
-          <w:p>
-            <w:pPr>
-              <w:pStyle w:val="Compact"/>
-            </w:pPr>
-            <w:r>
-              <w:t xml:space="preserve">Median ICER</w:t>
-            </w:r>
-          </w:p>
-        </w:tc>
-        <w:tc>
-          <w:tcPr/>
-          <w:p>
-            <w:pPr>
-              <w:pStyle w:val="Compact"/>
-            </w:pPr>
-            <w:r>
-              <w:t xml:space="preserve">$51,134</w:t>
-            </w:r>
-          </w:p>
-        </w:tc>
-      </w:tr>
-      <w:tr>
-        <w:tc>
-          <w:tcPr/>
-          <w:p>
-            <w:pPr>
-              <w:pStyle w:val="Compact"/>
-            </w:pPr>
-            <w:r>
-              <w:t xml:space="preserve">95% CI</w:t>
-            </w:r>
-          </w:p>
-        </w:tc>
-        <w:tc>
-          <w:tcPr/>
-          <w:p>
-            <w:pPr>
-              <w:pStyle w:val="Compact"/>
-            </w:pPr>
-            <w:r>
-              <w:t xml:space="preserve">$39,675 – $66,391</w:t>
-            </w:r>
-          </w:p>
-        </w:tc>
-      </w:tr>
-      <w:tr>
-        <w:tc>
-          <w:tcPr/>
-          <w:p>
-            <w:pPr>
-              <w:pStyle w:val="Compact"/>
-            </w:pPr>
-            <w:r>
-              <w:t xml:space="preserve">P(CE) at $100K/QALY</w:t>
-            </w:r>
-          </w:p>
-        </w:tc>
-        <w:tc>
-          <w:tcPr/>
-          <w:p>
-            <w:pPr>
-              <w:pStyle w:val="Compact"/>
-            </w:pPr>
-            <w:r>
-              <w:t xml:space="preserve">100%</w:t>
-            </w:r>
-          </w:p>
-        </w:tc>
-      </w:tr>
-      <w:tr>
-        <w:tc>
-          <w:tcPr/>
-          <w:p>
-            <w:pPr>
-              <w:pStyle w:val="Compact"/>
-            </w:pPr>
-            <w:r>
-              <w:t xml:space="preserve">P(CE) at $150K/QALY</w:t>
-            </w:r>
-          </w:p>
-        </w:tc>
-        <w:tc>
-          <w:tcPr/>
-          <w:p>
-            <w:pPr>
-              <w:pStyle w:val="Compact"/>
-            </w:pPr>
-            <w:r>
-              <w:t xml:space="preserve">100%</w:t>
-            </w:r>
-          </w:p>
-        </w:tc>
-      </w:tr>
-    </w:tbl>
+    <w:p>
+      <w:pPr>
+        <w:pStyle w:val="BodyText"/>
+      </w:pPr>
+      <w:r>
+        <w:t xml:space="preserve">Metric | Value |</w:t>
+      </w:r>
+    </w:p>
+    <w:p>
+      <w:pPr>
+        <w:pStyle w:val="BodyText"/>
+      </w:pPr>
+      <w:r>
+        <w:t xml:space="preserve">|——–|——-|</w:t>
+      </w:r>
+    </w:p>
+    <w:p>
+      <w:pPr>
+        <w:pStyle w:val="BodyText"/>
+      </w:pPr>
+      <w:r>
+        <w:t xml:space="preserve">Mean ICER | $51,613 |</w:t>
+      </w:r>
+    </w:p>
+    <w:p>
+      <w:pPr>
+        <w:pStyle w:val="BodyText"/>
+      </w:pPr>
+      <w:r>
+        <w:t xml:space="preserve">Median ICER | $51,134 |</w:t>
+      </w:r>
+    </w:p>
+    <w:p>
+      <w:pPr>
+        <w:pStyle w:val="BodyText"/>
+      </w:pPr>
+      <w:r>
+        <w:t xml:space="preserve">95% CI | $39,675 – $66,391 |</w:t>
+      </w:r>
+    </w:p>
+    <w:p>
+      <w:pPr>
+        <w:pStyle w:val="BodyText"/>
+      </w:pPr>
+      <w:r>
+        <w:t xml:space="preserve">P(CE) at $100K/QALY | 100% |</w:t>
+      </w:r>
+    </w:p>
+    <w:p>
+      <w:pPr>
+        <w:pStyle w:val="BodyText"/>
+      </w:pPr>
+      <w:r>
+        <w:t xml:space="preserve">P(CE) at $150K/QALY | 100% |</w:t>
+      </w:r>
+    </w:p>
     <w:bookmarkEnd w:id="24"/>
     <w:bookmarkStart w:id="25" w:name="deterministic-sensitivity-analysis"/>
     <w:p>
@@ -2087,332 +1281,110 @@
         <w:t xml:space="preserve">Table 4. Scenario Analyses</w:t>
       </w:r>
     </w:p>
-    <w:tbl>
-      <w:tblPr>
-        <w:tblStyle w:val="Table"/>
-        <w:tblW w:type="auto" w:w="0"/>
-        <w:tblLook w:firstRow="1" w:lastRow="0" w:firstColumn="0" w:lastColumn="0" w:noHBand="0" w:noVBand="0" w:val="0020"/>
-      </w:tblPr>
-      <w:tblGrid>
-        <w:gridCol w:w="3960"/>
-        <w:gridCol w:w="3960"/>
-      </w:tblGrid>
-      <w:tr>
-        <w:trPr>
-          <w:tblHeader w:val="on"/>
-        </w:trPr>
-        <w:tc>
-          <w:tcPr/>
-          <w:p>
-            <w:pPr>
-              <w:pStyle w:val="Compact"/>
-              <w:jc w:val="left"/>
-            </w:pPr>
-            <w:r>
-              <w:t xml:space="preserve">Scenario</w:t>
-            </w:r>
-          </w:p>
-        </w:tc>
-        <w:tc>
-          <w:tcPr/>
-          <w:p>
-            <w:pPr>
-              <w:pStyle w:val="Compact"/>
-              <w:jc w:val="center"/>
-            </w:pPr>
-            <w:r>
-              <w:t xml:space="preserve">ICER</w:t>
-            </w:r>
-          </w:p>
-        </w:tc>
-      </w:tr>
-      <w:tr>
-        <w:tc>
-          <w:tcPr/>
-          <w:p>
-            <w:pPr>
-              <w:pStyle w:val="Compact"/>
-              <w:jc w:val="left"/>
-            </w:pPr>
-            <w:r>
-              <w:t xml:space="preserve">Base case (log-normal, 40y)</w:t>
-            </w:r>
-          </w:p>
-        </w:tc>
-        <w:tc>
-          <w:tcPr/>
-          <w:p>
-            <w:pPr>
-              <w:pStyle w:val="Compact"/>
-              <w:jc w:val="center"/>
-            </w:pPr>
-            <w:r>
-              <w:t xml:space="preserve">$51,753</w:t>
-            </w:r>
-          </w:p>
-        </w:tc>
-      </w:tr>
-      <w:tr>
-        <w:tc>
-          <w:tcPr/>
-          <w:p>
-            <w:pPr>
-              <w:pStyle w:val="Compact"/>
-              <w:jc w:val="left"/>
-            </w:pPr>
-            <w:r>
-              <w:t xml:space="preserve">Intismeran $100,000</w:t>
-            </w:r>
-          </w:p>
-        </w:tc>
-        <w:tc>
-          <w:tcPr/>
-          <w:p>
-            <w:pPr>
-              <w:pStyle w:val="Compact"/>
-              <w:jc w:val="center"/>
-            </w:pPr>
-            <w:r>
-              <w:t xml:space="preserve">$37,896</w:t>
-            </w:r>
-          </w:p>
-        </w:tc>
-      </w:tr>
-      <w:tr>
-        <w:tc>
-          <w:tcPr/>
-          <w:p>
-            <w:pPr>
-              <w:pStyle w:val="Compact"/>
-              <w:jc w:val="left"/>
-            </w:pPr>
-            <w:r>
-              <w:t xml:space="preserve">Intismeran $300,000</w:t>
-            </w:r>
-          </w:p>
-        </w:tc>
-        <w:tc>
-          <w:tcPr/>
-          <w:p>
-            <w:pPr>
-              <w:pStyle w:val="Compact"/>
-              <w:jc w:val="center"/>
-            </w:pPr>
-            <w:r>
-              <w:t xml:space="preserve">$65,609</w:t>
-            </w:r>
-          </w:p>
-        </w:tc>
-      </w:tr>
-      <w:tr>
-        <w:tc>
-          <w:tcPr/>
-          <w:p>
-            <w:pPr>
-              <w:pStyle w:val="Compact"/>
-              <w:jc w:val="left"/>
-            </w:pPr>
-            <w:r>
-              <w:t xml:space="preserve">Intismeran $500,000</w:t>
-            </w:r>
-          </w:p>
-        </w:tc>
-        <w:tc>
-          <w:tcPr/>
-          <w:p>
-            <w:pPr>
-              <w:pStyle w:val="Compact"/>
-              <w:jc w:val="center"/>
-            </w:pPr>
-            <w:r>
-              <w:t xml:space="preserve">$93,323</w:t>
-            </w:r>
-          </w:p>
-        </w:tc>
-      </w:tr>
-      <w:tr>
-        <w:tc>
-          <w:tcPr/>
-          <w:p>
-            <w:pPr>
-              <w:pStyle w:val="Compact"/>
-              <w:jc w:val="left"/>
-            </w:pPr>
-            <w:r>
-              <w:t xml:space="preserve">0% discount rate</w:t>
-            </w:r>
-          </w:p>
-        </w:tc>
-        <w:tc>
-          <w:tcPr/>
-          <w:p>
-            <w:pPr>
-              <w:pStyle w:val="Compact"/>
-              <w:jc w:val="center"/>
-            </w:pPr>
-            <w:r>
-              <w:t xml:space="preserve">$52,097</w:t>
-            </w:r>
-          </w:p>
-        </w:tc>
-      </w:tr>
-      <w:tr>
-        <w:tc>
-          <w:tcPr/>
-          <w:p>
-            <w:pPr>
-              <w:pStyle w:val="Compact"/>
-              <w:jc w:val="left"/>
-            </w:pPr>
-            <w:r>
-              <w:t xml:space="preserve">5% discount rate</w:t>
-            </w:r>
-          </w:p>
-        </w:tc>
-        <w:tc>
-          <w:tcPr/>
-          <w:p>
-            <w:pPr>
-              <w:pStyle w:val="Compact"/>
-              <w:jc w:val="center"/>
-            </w:pPr>
-            <w:r>
-              <w:t xml:space="preserve">$54,518</w:t>
-            </w:r>
-          </w:p>
-        </w:tc>
-      </w:tr>
-      <w:tr>
-        <w:tc>
-          <w:tcPr/>
-          <w:p>
-            <w:pPr>
-              <w:pStyle w:val="Compact"/>
-              <w:jc w:val="left"/>
-            </w:pPr>
-            <w:r>
-              <w:t xml:space="preserve">Weibull OS</w:t>
-            </w:r>
-          </w:p>
-        </w:tc>
-        <w:tc>
-          <w:tcPr/>
-          <w:p>
-            <w:pPr>
-              <w:pStyle w:val="Compact"/>
-              <w:jc w:val="center"/>
-            </w:pPr>
-            <w:r>
-              <w:t xml:space="preserve">$60,470</w:t>
-            </w:r>
-          </w:p>
-        </w:tc>
-      </w:tr>
-      <w:tr>
-        <w:tc>
-          <w:tcPr/>
-          <w:p>
-            <w:pPr>
-              <w:pStyle w:val="Compact"/>
-              <w:jc w:val="left"/>
-            </w:pPr>
-            <w:r>
-              <w:t xml:space="preserve">Treatment-effect waning (5→20y)</w:t>
-            </w:r>
-          </w:p>
-        </w:tc>
-        <w:tc>
-          <w:tcPr/>
-          <w:p>
-            <w:pPr>
-              <w:pStyle w:val="Compact"/>
-              <w:jc w:val="center"/>
-            </w:pPr>
-            <w:r>
-              <w:t xml:space="preserve">$18,805</w:t>
-            </w:r>
-          </w:p>
-        </w:tc>
-      </w:tr>
-      <w:tr>
-        <w:tc>
-          <w:tcPr/>
-          <w:p>
-            <w:pPr>
-              <w:pStyle w:val="Compact"/>
-              <w:jc w:val="left"/>
-            </w:pPr>
-            <w:r>
-              <w:t xml:space="preserve">General population constraint</w:t>
-            </w:r>
-          </w:p>
-        </w:tc>
-        <w:tc>
-          <w:tcPr/>
-          <w:p>
-            <w:pPr>
-              <w:pStyle w:val="Compact"/>
-              <w:jc w:val="center"/>
-            </w:pPr>
-            <w:r>
-              <w:t xml:space="preserve">$40,724</w:t>
-            </w:r>
-          </w:p>
-        </w:tc>
-      </w:tr>
-      <w:tr>
-        <w:tc>
-          <w:tcPr/>
-          <w:p>
-            <w:pPr>
-              <w:pStyle w:val="Compact"/>
-              <w:jc w:val="left"/>
-            </w:pPr>
-            <w:r>
-              <w:t xml:space="preserve">10-year horizon</w:t>
-            </w:r>
-          </w:p>
-        </w:tc>
-        <w:tc>
-          <w:tcPr/>
-          <w:p>
-            <w:pPr>
-              <w:pStyle w:val="Compact"/>
-              <w:jc w:val="center"/>
-            </w:pPr>
-            <w:r>
-              <w:t xml:space="preserve">$73,052</w:t>
-            </w:r>
-          </w:p>
-        </w:tc>
-      </w:tr>
-      <w:tr>
-        <w:tc>
-          <w:tcPr/>
-          <w:p>
-            <w:pPr>
-              <w:pStyle w:val="Compact"/>
-              <w:jc w:val="left"/>
-            </w:pPr>
-            <w:r>
-              <w:t xml:space="preserve">20-year horizon</w:t>
-            </w:r>
-          </w:p>
-        </w:tc>
-        <w:tc>
-          <w:tcPr/>
-          <w:p>
-            <w:pPr>
-              <w:pStyle w:val="Compact"/>
-              <w:jc w:val="center"/>
-            </w:pPr>
-            <w:r>
-              <w:t xml:space="preserve">$41,878</w:t>
-            </w:r>
-          </w:p>
-        </w:tc>
-      </w:tr>
-    </w:tbl>
+    <w:p>
+      <w:pPr>
+        <w:pStyle w:val="BodyText"/>
+      </w:pPr>
+      <w:r>
+        <w:t xml:space="preserve">Scenario | ICER |</w:t>
+      </w:r>
+    </w:p>
+    <w:p>
+      <w:pPr>
+        <w:pStyle w:val="BodyText"/>
+      </w:pPr>
+      <w:r>
+        <w:t xml:space="preserve">|:—|:—:|</w:t>
+      </w:r>
+    </w:p>
+    <w:p>
+      <w:pPr>
+        <w:pStyle w:val="BodyText"/>
+      </w:pPr>
+      <w:r>
+        <w:t xml:space="preserve">Base case (log-normal, 40y) | $51,753 |</w:t>
+      </w:r>
+    </w:p>
+    <w:p>
+      <w:pPr>
+        <w:pStyle w:val="BodyText"/>
+      </w:pPr>
+      <w:r>
+        <w:t xml:space="preserve">Intismeran $100,000 | $37,896 |</w:t>
+      </w:r>
+    </w:p>
+    <w:p>
+      <w:pPr>
+        <w:pStyle w:val="BodyText"/>
+      </w:pPr>
+      <w:r>
+        <w:t xml:space="preserve">Intismeran $300,000 | $65,609 |</w:t>
+      </w:r>
+    </w:p>
+    <w:p>
+      <w:pPr>
+        <w:pStyle w:val="BodyText"/>
+      </w:pPr>
+      <w:r>
+        <w:t xml:space="preserve">Intismeran $500,000 | $93,323 |</w:t>
+      </w:r>
+    </w:p>
+    <w:p>
+      <w:pPr>
+        <w:pStyle w:val="BodyText"/>
+      </w:pPr>
+      <w:r>
+        <w:t xml:space="preserve">0% discount rate | $52,097 |</w:t>
+      </w:r>
+    </w:p>
+    <w:p>
+      <w:pPr>
+        <w:pStyle w:val="BodyText"/>
+      </w:pPr>
+      <w:r>
+        <w:t xml:space="preserve">5% discount rate | $54,518 |</w:t>
+      </w:r>
+    </w:p>
+    <w:p>
+      <w:pPr>
+        <w:pStyle w:val="BodyText"/>
+      </w:pPr>
+      <w:r>
+        <w:t xml:space="preserve">Weibull OS | $60,470 |</w:t>
+      </w:r>
+    </w:p>
+    <w:p>
+      <w:pPr>
+        <w:pStyle w:val="BodyText"/>
+      </w:pPr>
+      <w:r>
+        <w:t xml:space="preserve">Treatment-effect waning (5→20y) | $18,805 |</w:t>
+      </w:r>
+    </w:p>
+    <w:p>
+      <w:pPr>
+        <w:pStyle w:val="BodyText"/>
+      </w:pPr>
+      <w:r>
+        <w:t xml:space="preserve">General population constraint | $40,724 |</w:t>
+      </w:r>
+    </w:p>
+    <w:p>
+      <w:pPr>
+        <w:pStyle w:val="BodyText"/>
+      </w:pPr>
+      <w:r>
+        <w:t xml:space="preserve">10-year horizon | $73,052 |</w:t>
+      </w:r>
+    </w:p>
+    <w:p>
+      <w:pPr>
+        <w:pStyle w:val="BodyText"/>
+      </w:pPr>
+      <w:r>
+        <w:t xml:space="preserve">20-year horizon | $41,878 |</w:t>
+      </w:r>
+    </w:p>
     <w:p>
       <w:pPr>
         <w:pStyle w:val="BodyText"/>
@@ -2723,81 +1695,107 @@
       <w:r>
         <w:t xml:space="preserve">[1] Weber JS, et al. Lancet 2024;403:632-644.</w:t>
       </w:r>
-      <w:r>
-        <w:t xml:space="preserve"> </w:t>
-      </w:r>
+    </w:p>
+    <w:p>
+      <w:pPr>
+        <w:pStyle w:val="BodyText"/>
+      </w:pPr>
       <w:r>
         <w:t xml:space="preserve">[2] Merck &amp; Moderna. Press release, August 19, 2026.</w:t>
       </w:r>
-      <w:r>
-        <w:t xml:space="preserve"> </w:t>
-      </w:r>
+    </w:p>
+    <w:p>
+      <w:pPr>
+        <w:pStyle w:val="BodyText"/>
+      </w:pPr>
       <w:r>
         <w:t xml:space="preserve">[3] Khattak A, et al. J Clin Oncol 2026;44:JCO2600835.</w:t>
       </w:r>
-      <w:r>
-        <w:t xml:space="preserve"> </w:t>
-      </w:r>
+    </w:p>
+    <w:p>
+      <w:pPr>
+        <w:pStyle w:val="BodyText"/>
+      </w:pPr>
       <w:r>
         <w:t xml:space="preserve">[4] Ibragimova AA, Fedorov AA, Kirilenko KM, Choynzonov EL. mRNA-based personalized cancer vaccines: opportunities, challenges and outcomes. Acta Naturae 2025;17(4):17-29.</w:t>
       </w:r>
-      <w:r>
-        <w:t xml:space="preserve"> </w:t>
-      </w:r>
+    </w:p>
+    <w:p>
+      <w:pPr>
+        <w:pStyle w:val="BodyText"/>
+      </w:pPr>
       <w:r>
         <w:t xml:space="preserve">[5] Li X, Jabbarzadeh Kaboli P, et al. Next-generation neoantigen mRNA vaccines: immuno-engineering strategies for precision cancer immunotherapy. Cell Oncol 2026;49(2).</w:t>
       </w:r>
-      <w:r>
-        <w:t xml:space="preserve"> </w:t>
-      </w:r>
+    </w:p>
+    <w:p>
+      <w:pPr>
+        <w:pStyle w:val="BodyText"/>
+      </w:pPr>
       <w:r>
         <w:t xml:space="preserve">[6] Wu DW, Jia SP, Xing SJ, Ma HL. Personalized neoantigen cancer vaccines: current progression, challenges and a bright future. Clin Exp Med 2024;24(1):229.</w:t>
       </w:r>
-      <w:r>
-        <w:t xml:space="preserve"> </w:t>
-      </w:r>
+    </w:p>
+    <w:p>
+      <w:pPr>
+        <w:pStyle w:val="BodyText"/>
+      </w:pPr>
       <w:r>
         <w:t xml:space="preserve">[7] Jefferies Equity Research. Moderna Initiation, 2026.</w:t>
       </w:r>
-      <w:r>
-        <w:t xml:space="preserve"> </w:t>
-      </w:r>
+    </w:p>
+    <w:p>
+      <w:pPr>
+        <w:pStyle w:val="BodyText"/>
+      </w:pPr>
       <w:r>
         <w:t xml:space="preserve">[8] Woods B, et al. Med Decis Making 2020;40:461-471.</w:t>
       </w:r>
-      <w:r>
-        <w:t xml:space="preserve"> </w:t>
-      </w:r>
+    </w:p>
+    <w:p>
+      <w:pPr>
+        <w:pStyle w:val="BodyText"/>
+      </w:pPr>
       <w:r>
         <w:t xml:space="preserve">[9] Keytruda.com. Cost Information, March 2026. GoodRx, May 2026.</w:t>
       </w:r>
-      <w:r>
-        <w:t xml:space="preserve"> </w:t>
-      </w:r>
+    </w:p>
+    <w:p>
+      <w:pPr>
+        <w:pStyle w:val="BodyText"/>
+      </w:pPr>
       <w:r>
         <w:t xml:space="preserve">[10] Schwarze K, et al. Eur J Hum Genet 2020;28:1322-1331.</w:t>
       </w:r>
-      <w:r>
-        <w:t xml:space="preserve"> </w:t>
-      </w:r>
+    </w:p>
+    <w:p>
+      <w:pPr>
+        <w:pStyle w:val="BodyText"/>
+      </w:pPr>
       <w:r>
         <w:t xml:space="preserve">[11] Bensimon AG, Zhou ZY, Jenkins M, et al. Cost-effectiveness of pembrolizumab for the adjuvant treatment of resected high-risk stage III melanoma in the United States. J Med Econ 2019;22(10):981-993.</w:t>
       </w:r>
-      <w:r>
-        <w:t xml:space="preserve"> </w:t>
-      </w:r>
+    </w:p>
+    <w:p>
+      <w:pPr>
+        <w:pStyle w:val="BodyText"/>
+      </w:pPr>
       <w:r>
         <w:t xml:space="preserve">[12] Johnston KM, et al. Pharmacoeconomics 2021;39:241-253.</w:t>
       </w:r>
-      <w:r>
-        <w:t xml:space="preserve"> </w:t>
-      </w:r>
+    </w:p>
+    <w:p>
+      <w:pPr>
+        <w:pStyle w:val="BodyText"/>
+      </w:pPr>
       <w:r>
         <w:t xml:space="preserve">[13] Zhang S, Bensimon AG, Xu R, et al. Cost-effectiveness analysis of pembrolizumab as an adjuvant treatment of resected stage IIB or IIC melanoma in the United States. Adv Ther 2023;40:3038-3055.</w:t>
       </w:r>
-      <w:r>
-        <w:t xml:space="preserve"> </w:t>
-      </w:r>
+    </w:p>
+    <w:p>
+      <w:pPr>
+        <w:pStyle w:val="BodyText"/>
+      </w:pPr>
       <w:r>
         <w:t xml:space="preserve">[14] Mclean A, van Hest N. An exploratory cost-effectiveness analysis of cancer vaccines in combination with current immune checkpoint inhibitors vs immune checkpoint inhibitor monotherapy: a case study for V940 in high-risk stage 3 melanoma in the US. Value Health 2024;27(12):S2 (EE354).</w:t>
       </w:r>

</xml_diff>